<commit_message>
Supply-area weather results (50/100/200 km) in Table 7 and Section 6; limitation and conclusion updated; word count 9,985
Co-Authored-By: Claude Opus 5.5 <noreply@anthropic.com>
Claude-Session: https://claude.ai/code/session_01NRJbht5wGeLjnfSMkL4ri5
</commit_message>
<xml_diff>
--- a/manuscript/Manuscript_anonymized.docx
+++ b/manuscript/Manuscript_anonymized.docx
@@ -108,7 +108,7 @@
         <w:pStyle w:val="FirstParagraph"/>
       </w:pPr>
       <w:r>
-        <w:t xml:space="preserve">Climate shocks are expected to raise food prices, but the evidence comes mostly from national price indices or single countries, and it says little about which foods and which markets absorb the shock. We combine 26 years of monthly retail prices from 3,221 markets in 85 low- and middle-income countries with reanalysis weather measured at each market. Panel local projections with series × calendar-month and country × year fixed effects show that a one-standard-deviation adverse weather anomaly (hotter and drier than normal) raises local staple prices by 0.99 percent after six months (95% CI 0.46 to 1.53). The effect persists for at least a year and survives correction for testing at seven horizons. The burden falls on staples that rarely cross borders. Maize, sorghum and millet, and roots and tubers respond by 1.2 to 1.7 percentage points more than rice. Rice and wheat prices do not respond, even though local weather lowers their national production by as much as it lowers other crops. A causal forest, validated on countries it was not trained on, finds that one third of market-months face a response four times the average, concentrated in arid areas. World price conditions do not amplify the local effect. Placebo tests, selection tests and eighteen alternative specifications support these results. Monitoring and assistance aimed at weather-driven food price spikes should target locally traded staples in dry markets, where trade cannot absorb a bad harvest.</w:t>
+        <w:t xml:space="preserve">Climate shocks are expected to raise food prices, but the evidence comes mostly from national price indices or single countries, and it says little about which foods and which markets absorb the shock. We combine 26 years of monthly retail prices from 3,221 markets in 85 low- and middle-income countries with reanalysis weather measured at each market. Panel local projections with series × calendar-month and country × year fixed effects show that a one-standard-deviation adverse weather anomaly (hotter and drier than normal) raises local staple prices by 0.99 percent after six months (95% CI 0.46 to 1.53). The effect persists for at least a year and survives correction for testing at seven horizons. The burden falls on staples that rarely cross borders. Maize, sorghum and millet, and roots and tubers respond by 1.2 to 1.7 percentage points more than rice. Rice and wheat prices do not respond, even though local weather lowers their national production by as much as it lowers other crops. A causal forest, validated on countries it was not trained on, finds that one third of market-months face a response four times the average, concentrated in arid areas. World price conditions do not amplify the local effect. Placebo tests, selection tests and twenty-one alternative specifications support these results. Monitoring and assistance aimed at weather-driven food price spikes should target locally traded staples in dry markets, where trade cannot absorb a bad harvest.</w:t>
       </w:r>
     </w:p>
     <w:p>
@@ -10253,6 +10253,228 @@
               <w:jc w:val="left"/>
             </w:pPr>
             <w:r>
+              <w:t xml:space="preserve">Supply-area weather, 50 km</w:t>
+            </w:r>
+          </w:p>
+        </w:tc>
+        <w:tc>
+          <w:tcPr/>
+          <w:p>
+            <w:pPr>
+              <w:pStyle w:val="Compact"/>
+              <w:jc w:val="left"/>
+            </w:pPr>
+            <w:r>
+              <w:t xml:space="preserve">1.02***</w:t>
+            </w:r>
+          </w:p>
+        </w:tc>
+        <w:tc>
+          <w:tcPr/>
+          <w:p>
+            <w:pPr>
+              <w:pStyle w:val="Compact"/>
+              <w:jc w:val="left"/>
+            </w:pPr>
+            <w:r>
+              <w:t xml:space="preserve">0.29</w:t>
+            </w:r>
+          </w:p>
+        </w:tc>
+        <w:tc>
+          <w:tcPr/>
+          <w:p>
+            <w:pPr>
+              <w:pStyle w:val="Compact"/>
+              <w:jc w:val="left"/>
+            </w:pPr>
+            <w:r>
+              <w:t xml:space="preserve">3.56</w:t>
+            </w:r>
+          </w:p>
+        </w:tc>
+        <w:tc>
+          <w:tcPr/>
+          <w:p>
+            <w:pPr>
+              <w:pStyle w:val="Compact"/>
+              <w:jc w:val="left"/>
+            </w:pPr>
+            <w:r>
+              <w:t xml:space="preserve">757,136</w:t>
+            </w:r>
+          </w:p>
+        </w:tc>
+      </w:tr>
+      <w:tr>
+        <w:tc>
+          <w:tcPr/>
+          <w:p>
+            <w:pPr>
+              <w:pStyle w:val="Compact"/>
+              <w:jc w:val="left"/>
+            </w:pPr>
+            <w:r>
+              <w:t xml:space="preserve">Measurement</w:t>
+            </w:r>
+          </w:p>
+        </w:tc>
+        <w:tc>
+          <w:tcPr/>
+          <w:p>
+            <w:pPr>
+              <w:pStyle w:val="Compact"/>
+              <w:jc w:val="left"/>
+            </w:pPr>
+            <w:r>
+              <w:t xml:space="preserve">Supply-area weather, 100 km</w:t>
+            </w:r>
+          </w:p>
+        </w:tc>
+        <w:tc>
+          <w:tcPr/>
+          <w:p>
+            <w:pPr>
+              <w:pStyle w:val="Compact"/>
+              <w:jc w:val="left"/>
+            </w:pPr>
+            <w:r>
+              <w:t xml:space="preserve">1.08***</w:t>
+            </w:r>
+          </w:p>
+        </w:tc>
+        <w:tc>
+          <w:tcPr/>
+          <w:p>
+            <w:pPr>
+              <w:pStyle w:val="Compact"/>
+              <w:jc w:val="left"/>
+            </w:pPr>
+            <w:r>
+              <w:t xml:space="preserve">0.31</w:t>
+            </w:r>
+          </w:p>
+        </w:tc>
+        <w:tc>
+          <w:tcPr/>
+          <w:p>
+            <w:pPr>
+              <w:pStyle w:val="Compact"/>
+              <w:jc w:val="left"/>
+            </w:pPr>
+            <w:r>
+              <w:t xml:space="preserve">3.49</w:t>
+            </w:r>
+          </w:p>
+        </w:tc>
+        <w:tc>
+          <w:tcPr/>
+          <w:p>
+            <w:pPr>
+              <w:pStyle w:val="Compact"/>
+              <w:jc w:val="left"/>
+            </w:pPr>
+            <w:r>
+              <w:t xml:space="preserve">757,136</w:t>
+            </w:r>
+          </w:p>
+        </w:tc>
+      </w:tr>
+      <w:tr>
+        <w:tc>
+          <w:tcPr/>
+          <w:p>
+            <w:pPr>
+              <w:pStyle w:val="Compact"/>
+              <w:jc w:val="left"/>
+            </w:pPr>
+            <w:r>
+              <w:t xml:space="preserve">Measurement</w:t>
+            </w:r>
+          </w:p>
+        </w:tc>
+        <w:tc>
+          <w:tcPr/>
+          <w:p>
+            <w:pPr>
+              <w:pStyle w:val="Compact"/>
+              <w:jc w:val="left"/>
+            </w:pPr>
+            <w:r>
+              <w:t xml:space="preserve">Supply-area weather, 200 km</w:t>
+            </w:r>
+          </w:p>
+        </w:tc>
+        <w:tc>
+          <w:tcPr/>
+          <w:p>
+            <w:pPr>
+              <w:pStyle w:val="Compact"/>
+              <w:jc w:val="left"/>
+            </w:pPr>
+            <w:r>
+              <w:t xml:space="preserve">1.18***</w:t>
+            </w:r>
+          </w:p>
+        </w:tc>
+        <w:tc>
+          <w:tcPr/>
+          <w:p>
+            <w:pPr>
+              <w:pStyle w:val="Compact"/>
+              <w:jc w:val="left"/>
+            </w:pPr>
+            <w:r>
+              <w:t xml:space="preserve">0.33</w:t>
+            </w:r>
+          </w:p>
+        </w:tc>
+        <w:tc>
+          <w:tcPr/>
+          <w:p>
+            <w:pPr>
+              <w:pStyle w:val="Compact"/>
+              <w:jc w:val="left"/>
+            </w:pPr>
+            <w:r>
+              <w:t xml:space="preserve">3.53</w:t>
+            </w:r>
+          </w:p>
+        </w:tc>
+        <w:tc>
+          <w:tcPr/>
+          <w:p>
+            <w:pPr>
+              <w:pStyle w:val="Compact"/>
+              <w:jc w:val="left"/>
+            </w:pPr>
+            <w:r>
+              <w:t xml:space="preserve">757,136</w:t>
+            </w:r>
+          </w:p>
+        </w:tc>
+      </w:tr>
+      <w:tr>
+        <w:tc>
+          <w:tcPr/>
+          <w:p>
+            <w:pPr>
+              <w:pStyle w:val="Compact"/>
+              <w:jc w:val="left"/>
+            </w:pPr>
+            <w:r>
+              <w:t xml:space="preserve">Measurement</w:t>
+            </w:r>
+          </w:p>
+        </w:tc>
+        <w:tc>
+          <w:tcPr/>
+          <w:p>
+            <w:pPr>
+              <w:pStyle w:val="Compact"/>
+              <w:jc w:val="left"/>
+            </w:pPr>
+            <w:r>
               <w:t xml:space="preserve">Prices in US dollars</w:t>
             </w:r>
           </w:p>
@@ -10766,7 +10988,7 @@
         <w:t xml:space="preserve"> </w:t>
       </w:r>
       <w:r>
-        <w:t xml:space="preserve">Each row changes one element of the baseline in the first row. Standard errors two-way clustered by country and month unless stated.</w:t>
+        <w:t xml:space="preserve">Each row changes one element of the baseline in the first row. Supply-area weather averages ERA5 heat and soil moisture over land within the stated radius. Standard errors two-way clustered by country and month unless stated.</w:t>
       </w:r>
     </w:p>
     <w:p>
@@ -10806,7 +11028,7 @@
         <w:pStyle w:val="BodyText"/>
       </w:pPr>
       <w:r>
-        <w:t xml:space="preserve">How W is built matters in one predictable way. The estimate rises with the aggregation window, from 0.56 percent for one month to 0.81, 0.99 and 1.40 percent for two, three and six months. Prices respond to accumulated seasonal anomalies, not to monthly weather, which makes our three-month baseline conservative. For the same reason the monthly innovation of the three-month index has no detectable effect (0.13 percent, SE 0.12). Capping z-scores at ±3 or ±5, removing the cap, or detrending W by market leaves the estimate between 0.94 and 1.02 percent. In US dollars the effect is 0.76 percent (SE 0.29); it is slightly smaller because dollar prices also carry exchange-rate noise. Winsorizing the outcome at the 1st and 99th percentiles gives 0.93 percent (SE 0.27).</w:t>
+        <w:t xml:space="preserve">How W is built matters in one predictable way. The estimate rises with the aggregation window, from 0.56 percent for one month to 0.81, 0.99 and 1.40 percent for two, three and six months. Prices respond to accumulated seasonal anomalies, not to monthly weather, which makes our three-month baseline conservative. For the same reason the monthly innovation of the three-month index has no detectable effect (0.13 percent, SE 0.12). Averaging heat and soil moisture over land within 50, 100 and 200 km of the market raises the estimate to 1.02, 1.08 and 1.18 percent. Entered jointly with the point measure, the 200 km measure keeps the effect (1.24 percent, SE 0.45) and the point measure falls to −0.06 (SE 0.22), so point weather attenuates the baseline. Capping z-scores at ±3 or ±5, removing the cap, or detrending W by market leaves the estimate between 0.94 and 1.02 percent. In US dollars the effect is 0.76 percent (SE 0.29); it is slightly smaller because dollar prices also carry exchange-rate noise. Winsorizing the outcome at the 1st and 99th percentiles gives 0.93 percent (SE 0.27).</w:t>
       </w:r>
     </w:p>
     <w:p>
@@ -11375,7 +11597,7 @@
         <w:pStyle w:val="BodyText"/>
       </w:pPr>
       <w:r>
-        <w:t xml:space="preserve">Brown and Kshirsagar (2015) estimated weather effects market by market and found them in about a fifth of markets. Our pooled estimate is consistent with that share once heterogeneity is allowed for, since the top tercile carries most of the effect. Okou et al. (2022) show that imported staples follow world prices almost one for one. We find the reverse side of the same market: local staples follow local weather, and imported staples do not. Put together, the two results describe a split market in which households that eat traded staples carry world price risk and households that eat local staples carry local weather risk. Kotz et al. (2024) find that heat raises national food inflation for a year. Our market-level estimates confirm that persistence but trace it to rainfall at short horizons and heat at long ones; national indices average over products and hide the difference between traded and local staples.</w:t>
+        <w:t xml:space="preserve">Brown and Kshirsagar (2015) estimated weather effects market by market and found them in about a fifth of markets. Our pooled estimate is consistent with that share once heterogeneity is allowed for, since the top tercile carries most of the effect. Okou et al. (2022) show that imported staples follow world prices almost one for one. We find the reverse side of the same market: local staples follow local weather, and imported staples do not. Kotz et al. (2024) find that heat raises national food inflation for a year. Our market-level estimates confirm that persistence but trace it to rainfall at short horizons and heat at long ones; national indices average over products and hide the difference between traded and local staples.</w:t>
       </w:r>
     </w:p>
     <w:bookmarkEnd w:id="43"/>
@@ -11409,7 +11631,7 @@
         <w:pStyle w:val="BodyText"/>
       </w:pPr>
       <w:r>
-        <w:t xml:space="preserve">Weather might instead set off conflict, which then raises prices, the feedback Raleigh et al. (2015) describe for African markets. Conflict exposure does not change the effect (+0.15 pp, MDE 0.66 pp), and the estimate is unchanged when the ten crisis economies are dropped. Finally, WFP could start monitoring markets after bad seasons, so that the sample over-represents shocks; the entry test rules this out.</w:t>
+        <w:t xml:space="preserve">Weather might instead set off conflict, which then raises prices, the feedback Raleigh et al. (2015) describe for African markets. Conflict exposure does not change the effect (+0.15 pp, MDE 0.66 pp), and the estimate is unchanged when the ten crisis economies are dropped.</w:t>
       </w:r>
     </w:p>
     <w:p>
@@ -11469,7 +11691,7 @@
         <w:pStyle w:val="FirstParagraph"/>
       </w:pPr>
       <w:r>
-        <w:t xml:space="preserve">W is measured at the market rather than over the area that supplies it. Where that area lies far away, the estimate of</w:t>
+        <w:t xml:space="preserve">W is measured near the market. Averaging over a 200 km supply area raises the estimate (Section 6), but food shipped from farther away is not captured, so</w:t>
       </w:r>
       <w:r>
         <w:t xml:space="preserve"> </w:t>
@@ -11492,7 +11714,7 @@
         <w:t xml:space="preserve"> </w:t>
       </w:r>
       <w:r>
-        <w:t xml:space="preserve">is attenuated toward zero.</w:t>
+        <w:t xml:space="preserve">remains a lower bound.</w:t>
       </w:r>
     </w:p>
     <w:p>
@@ -11551,7 +11773,7 @@
         <w:pStyle w:val="BodyText"/>
       </w:pPr>
       <w:r>
-        <w:t xml:space="preserve">Two extensions would sharpen these results. Measuring weather over each market’s supply area rather than at the market would reduce attenuation. Linking the price estimates to household survey data would turn the staple-basket exposure in Section 5.5 into welfare losses for specific groups of buyers and sellers.</w:t>
+        <w:t xml:space="preserve">Two extensions would sharpen these results. Weather measured over each market’s actual sourcing area, rather than a fixed radius, would reduce the remaining attenuation. Linking the price estimates to household survey data would turn the staple-basket exposure in Section 5.5 into welfare losses for specific groups of buyers and sellers.</w:t>
       </w:r>
     </w:p>
     <w:bookmarkEnd w:id="48"/>

</xml_diff>

<commit_message>
Fixes from Cowork review: equations numbered in order, maize rounding, wheat production claim, lower-bound wording, horse-race caveat; script 10 runs without ERA5; quintile calibration added to 07
Co-Authored-By: Claude Opus 5.5 <noreply@anthropic.com>
Claude-Session: https://claude.ai/code/session_01NRJbht5wGeLjnfSMkL4ri5
</commit_message>
<xml_diff>
--- a/manuscript/Manuscript_anonymized.docx
+++ b/manuscript/Manuscript_anonymized.docx
@@ -108,7 +108,7 @@
         <w:pStyle w:val="FirstParagraph"/>
       </w:pPr>
       <w:r>
-        <w:t xml:space="preserve">Climate shocks are expected to raise food prices, but the evidence comes mostly from national price indices or single countries, and it says little about which foods and which markets absorb the shock. We combine 26 years of monthly retail prices from 3,221 markets in 85 low- and middle-income countries with reanalysis weather measured at each market. Panel local projections with series × calendar-month and country × year fixed effects show that a one-standard-deviation adverse weather anomaly (hotter and drier than normal) raises local staple prices by 0.99 percent after six months (95% CI 0.46 to 1.53). The effect persists for at least a year and survives correction for testing at seven horizons. The burden falls on staples that rarely cross borders. Maize, sorghum and millet, and roots and tubers respond by 1.2 to 1.7 percentage points more than rice. Rice and wheat prices do not respond, even though local weather lowers their national production by as much as it lowers other crops. A causal forest, validated on countries it was not trained on, finds that one third of market-months face a response four times the average, concentrated in arid areas. World price conditions do not amplify the local effect. Placebo tests, selection tests and twenty-one alternative specifications support these results. Monitoring and assistance aimed at weather-driven food price spikes should target locally traded staples in dry markets, where trade cannot absorb a bad harvest.</w:t>
+        <w:t xml:space="preserve">Climate shocks are expected to raise food prices, but the evidence comes mostly from national price indices or single countries, and it says little about which foods and which markets absorb the shock. We combine 26 years of monthly retail prices from 3,221 markets in 85 low- and middle-income countries with reanalysis weather measured at each market. Panel local projections with series × calendar-month and country × year fixed effects show that a one-standard-deviation adverse weather anomaly (hotter and drier than normal) raises local staple prices by 0.99 percent after six months (95% CI 0.46 to 1.53). The effect persists for at least a year and survives correction for testing at seven horizons. The burden falls on staples that rarely cross borders. Maize, sorghum and millet, and roots and tubers respond by 1.2 to 1.7 percentage points more than rice. Rice and wheat prices do not respond, even though local weather lowers national rice production about as much as that of other crops. A causal forest, validated on countries it was not trained on, finds that one third of market-months face a response four times the average, concentrated in arid areas. World price conditions do not amplify the local effect. Placebo tests, selection tests and twenty-one alternative specifications support these results. Monitoring and assistance aimed at weather-driven food price spikes should target locally traded staples in dry markets, where trade cannot absorb a bad harvest.</w:t>
       </w:r>
     </w:p>
     <w:p>
@@ -703,7 +703,7 @@
             </m:dPr>
             <m:e>
               <m:r>
-                <m:t>4</m:t>
+                <m:t>1</m:t>
               </m:r>
             </m:e>
           </m:d>
@@ -1025,7 +1025,7 @@
             </m:dPr>
             <m:e>
               <m:r>
-                <m:t>5</m:t>
+                <m:t>2</m:t>
               </m:r>
             </m:e>
           </m:d>
@@ -1105,7 +1105,7 @@
         </m:r>
       </m:oMath>
       <w:r>
-        <w:t xml:space="preserve">. When it does not bind, the response equals Eq. (4). Storage (Deaton and Laroque, 1992) smooths the response over the months after the harvest but does not change its sign.</w:t>
+        <w:t xml:space="preserve">. When it does not bind, the response equals Eq. (1). Storage (Deaton and Laroque, 1992) smooths the response over the months after the harvest but does not change its sign.</w:t>
       </w:r>
     </w:p>
     <w:bookmarkEnd w:id="23"/>
@@ -1771,7 +1771,7 @@
             </m:dPr>
             <m:e>
               <m:r>
-                <m:t>1</m:t>
+                <m:t>3</m:t>
               </m:r>
             </m:e>
           </m:d>
@@ -3341,7 +3341,7 @@
             </m:dPr>
             <m:e>
               <m:r>
-                <m:t>2</m:t>
+                <m:t>4</m:t>
               </m:r>
             </m:e>
           </m:d>
@@ -3379,7 +3379,7 @@
         <w:t xml:space="preserve"> </w:t>
       </w:r>
       <w:r>
-        <w:t xml:space="preserve">is the index in Eq. (1),</w:t>
+        <w:t xml:space="preserve">is the index in Eq. (3),</w:t>
       </w:r>
       <w:r>
         <w:t xml:space="preserve"> </w:t>
@@ -3784,7 +3784,7 @@
         <w:pStyle w:val="FirstParagraph"/>
       </w:pPr>
       <w:r>
-        <w:t xml:space="preserve">For H3, we residualize the six-month outcome and W on the fixed effects and controls of Eq. (2) and fit a causal forest with W as a continuous treatment (Athey et al., 2019). The forest uses honest splitting, 400 trees and leaves of at least 200 observations. Its inputs are distance to the coast, climatological aridity (log mean annual rainfall), climatological heat exposure, absolute latitude, product group and a label for imported products.</w:t>
+        <w:t xml:space="preserve">For H3, we residualize the six-month outcome and W on the fixed effects and controls of Eq. (4) and fit a causal forest with W as a continuous treatment (Athey et al., 2019). The forest uses honest splitting, 400 trees and leaves of at least 200 observations. Its inputs are distance to the coast, climatological aridity (log mean annual rainfall), climatological heat exposure, absolute latitude, product group and a label for imported products.</w:t>
       </w:r>
     </w:p>
     <w:p>
@@ -3792,7 +3792,7 @@
         <w:pStyle w:val="BodyText"/>
       </w:pPr>
       <w:r>
-        <w:t xml:space="preserve">A flexible learner can mistake noise for heterogeneity, so we cross-fit by country. The forest is trained on a random half of countries and predicts effects for the other half, then the halves swap. We sort market-months into terciles of predicted effect and re-estimate Eq. (2) inside each tercile, using only countries the forest did not see. If the forest has found heterogeneity that exists, realized effects should rise across terciles. A linear projection of the effect on standardized moderators, with two-way clustered errors, complements the forest.</w:t>
+        <w:t xml:space="preserve">A flexible learner can mistake noise for heterogeneity, so we cross-fit by country. The forest is trained on a random half of countries and predicts effects for the other half, then the halves swap. We sort market-months into terciles of predicted effect and re-estimate Eq. (4) inside each tercile, using only countries the forest did not see. If the forest has found heterogeneity that exists, realized effects should rise across terciles. A linear projection of the effect on standardized moderators, with two-way clustered errors, complements the forest.</w:t>
       </w:r>
     </w:p>
     <w:p>
@@ -3957,7 +3957,7 @@
             </m:dPr>
             <m:e>
               <m:r>
-                <m:t>3</m:t>
+                <m:t>5</m:t>
               </m:r>
             </m:e>
           </m:d>
@@ -5297,7 +5297,7 @@
         <w:t xml:space="preserve"> </w:t>
       </w:r>
       <w:r>
-        <w:t xml:space="preserve">Local projections, Eq. (2). Dependent variable:</w:t>
+        <w:t xml:space="preserve">Local projections, Eq. (4). Dependent variable:</w:t>
       </w:r>
       <w:r>
         <w:t xml:space="preserve"> </w:t>
@@ -5418,7 +5418,7 @@
         <w:pStyle w:val="FirstParagraph"/>
       </w:pPr>
       <w:r>
-        <w:t xml:space="preserve">The response falls almost entirely on staples that rarely cross borders (Table 3; Figure 2). Rice, the reference product, shows a small and insignificant effect at every horizon (0.40 percent at six months, SE 0.27), and wheat cannot be told apart from rice (interaction −0.00 at six months, SE 0.33). Maize behaves very differently. It rises 1.41 pp more than rice at two months (SE 0.30) and 1.67 pp more at four (SE 0.42). Sorghum and millet add 1.40 pp at four months (SE 0.66), and roots and tubers 1.46 pp at six (SE 0.56). Products labelled as imported respond less than other products in the same market (−0.61 pp at four months, SE 0.38), but the difference is not significant, and with a minimum detectable effect of 1.1 pp a moderate gap cannot be ruled out.</w:t>
+        <w:t xml:space="preserve">The response falls almost entirely on staples that rarely cross borders (Table 3; Figure 2). Rice, the reference product, shows a small and insignificant effect at every horizon (0.40 percent at six months, SE 0.27), and wheat cannot be told apart from rice (interaction −0.00 at six months, SE 0.33). Maize behaves very differently. It rises 1.40 pp more than rice at two months (SE 0.29) and 1.67 pp more at four (SE 0.42). Sorghum and millet add 1.40 pp at four months (SE 0.66), and roots and tubers 1.46 pp at six (SE 0.56). Products labelled as imported respond less than other products in the same market (−0.61 pp at four months, SE 0.38), but the difference is not significant, and with a minimum detectable effect of 1.1 pp a moderate gap cannot be ruled out.</w:t>
       </w:r>
     </w:p>
     <w:p>
@@ -6619,7 +6619,7 @@
         <w:pStyle w:val="BodyText"/>
       </w:pPr>
       <w:r>
-        <w:t xml:space="preserve">The obvious reading of Table 3 is that import parity caps the price of traded staples, so a local shortfall is met by imports rather than by a higher price. A competing explanation is that rice and wheat in these markets are largely imported and local weather never touches their supply. Table 5 rules this out. An adverse year lowers national production by 7.4 percent per standard deviation across the eight crops (SE 2.3; 7,233 country-crop-years, 86 countries). Rice output falls by 6.3 percent (SE 2.8), and the gap between rice and wheat on one side and local staples on the other is small and insignificant (+3.2 pp, SE 3.4). Maize (−11.3 percent) and sorghum (−16.9 percent) fall most.</w:t>
+        <w:t xml:space="preserve">The obvious reading of Table 3 is that import parity caps the price of traded staples, so a local shortfall is met by imports rather than by a higher price. A competing explanation is that rice and wheat in these markets are largely imported and local weather never touches their supply. Table 5 rules this out. An adverse year lowers national production by 7.4 percent per standard deviation across the eight crops (SE 2.3; 7,233 country-crop-years, 86 countries). Rice output falls by 6.3 percent (SE 2.8) and wheat output by an imprecise 3.6 percent (SE 5.1), and the gap between rice and wheat on one side and local staples on the other is small and insignificant (+3.2 pp, SE 3.4). Maize (−11.3 percent) and sorghum (−16.9 percent) fall most.</w:t>
       </w:r>
     </w:p>
     <w:p>
@@ -7419,7 +7419,7 @@
         <w:t xml:space="preserve"> </w:t>
       </w:r>
       <w:r>
-        <w:t xml:space="preserve">Eq. (3). Dependent variable: ln production. Country × crop and crop × year fixed effects; standard errors clustered by country.</w:t>
+        <w:t xml:space="preserve">Eq. (5). Dependent variable: ln production. Country × crop and crop × year fixed effects; standard errors clustered by country.</w:t>
       </w:r>
     </w:p>
     <w:bookmarkEnd w:id="37"/>
@@ -10996,7 +10996,7 @@
         <w:pStyle w:val="BodyText"/>
       </w:pPr>
       <w:r>
-        <w:t xml:space="preserve">Two falsification tests support the causal reading. Weather six months in the future, added to Eq. (2), has no effect on current price changes (−0.05 pp at h = 0, SE 0.07; −0.12 pp at h = 2, SE 0.19). Weather at month</w:t>
+        <w:t xml:space="preserve">Two falsification tests support the causal reading. Weather six months in the future, added to Eq. (4), has no effect on current price changes (−0.05 pp at h = 0, SE 0.07; −0.12 pp at h = 2, SE 0.19). Weather at month</w:t>
       </w:r>
       <w:r>
         <w:t xml:space="preserve"> </w:t>
@@ -11028,7 +11028,7 @@
         <w:pStyle w:val="BodyText"/>
       </w:pPr>
       <w:r>
-        <w:t xml:space="preserve">How W is built matters in one predictable way. The estimate rises with the aggregation window, from 0.56 percent for one month to 0.81, 0.99 and 1.40 percent for two, three and six months. Prices respond to accumulated seasonal anomalies, not to monthly weather, which makes our three-month baseline conservative. For the same reason the monthly innovation of the three-month index has no detectable effect (0.13 percent, SE 0.12). Averaging heat and soil moisture over land within 50, 100 and 200 km of the market raises the estimate to 1.02, 1.08 and 1.18 percent. Entered jointly with the point measure, the 200 km measure keeps the effect (1.24 percent, SE 0.45) and the point measure falls to −0.06 (SE 0.22), so point weather attenuates the baseline. Capping z-scores at ±3 or ±5, removing the cap, or detrending W by market leaves the estimate between 0.94 and 1.02 percent. In US dollars the effect is 0.76 percent (SE 0.29); it is slightly smaller because dollar prices also carry exchange-rate noise. Winsorizing the outcome at the 1st and 99th percentiles gives 0.93 percent (SE 0.27).</w:t>
+        <w:t xml:space="preserve">How W is built matters in one predictable way. The estimate rises with the aggregation window, from 0.56 percent for one month to 0.81, 0.99 and 1.40 percent for two, three and six months. Prices respond to accumulated seasonal anomalies, not to monthly weather, which makes our three-month baseline conservative. For the same reason the monthly innovation of the three-month index has no detectable effect (0.13 percent, SE 0.12). Averaging heat and soil moisture over land within 50, 100 and 200 km of the market raises the estimate to 1.02, 1.08 and 1.18 percent. Entered jointly with the point measure, the 200 km measure keeps the effect (1.24 percent, SE 0.45) and the point measure falls to −0.06 (SE 0.22). The two measures correlate at 0.93, so this contrast is imprecise, but it points to attenuation in the baseline. Capping z-scores at ±3 or ±5, removing the cap, or detrending W by market leaves the estimate between 0.94 and 1.02 percent. In US dollars the effect is 0.76 percent (SE 0.29); it is slightly smaller because dollar prices also carry exchange-rate noise. Winsorizing the outcome at the 1st and 99th percentiles gives 0.93 percent (SE 0.27).</w:t>
       </w:r>
     </w:p>
     <w:p>
@@ -11639,7 +11639,7 @@
         <w:pStyle w:val="BodyText"/>
       </w:pPr>
       <w:r>
-        <w:t xml:space="preserve">What remains is a local supply shortfall passed through markets that are integrated for traded staples and segmented for local ones. The production results, with output falling for every major cereal, support that reading.</w:t>
+        <w:t xml:space="preserve">What remains is a local supply shortfall that imports offset only for traded staples.</w:t>
       </w:r>
     </w:p>
     <w:bookmarkEnd w:id="44"/>
@@ -11714,7 +11714,7 @@
         <w:t xml:space="preserve"> </w:t>
       </w:r>
       <w:r>
-        <w:t xml:space="preserve">remains a lower bound.</w:t>
+        <w:t xml:space="preserve">likely understates the effect.</w:t>
       </w:r>
     </w:p>
     <w:p>
@@ -11757,7 +11757,7 @@
         <w:pStyle w:val="FirstParagraph"/>
       </w:pPr>
       <w:r>
-        <w:t xml:space="preserve">Local weather moves local food prices, and it moves them in predictable places. Across 3,221 markets in 85 countries, a one-standard-deviation adverse anomaly raises staple prices by about 1 percent within six months, and the effect lasts a year. The burden falls on maize, sorghum and millet, and roots and tubers. Rice and wheat prices do not respond, even though their local production falls, because imports cap their price. Arid markets carry the largest effects, and a forest trained on one half of the countries identifies them in the other half. World price spikes do not make local shocks worse.</w:t>
+        <w:t xml:space="preserve">Local weather moves local food prices, and it moves them in predictable places. Across 3,221 markets in 85 countries, a one-standard-deviation adverse anomaly raises staple prices by about 1 percent within six months, and the effect lasts a year. The burden falls on maize, sorghum and millet, and roots and tubers. Rice and wheat prices do not respond, even though rice production falls, because imports cap their price. Arid markets carry the largest effects, and a forest trained on one half of the countries identifies them in the other half. World price spikes do not make local shocks worse.</w:t>
       </w:r>
     </w:p>
     <w:p>
@@ -12750,7 +12750,7 @@
         <w:t xml:space="preserve"> </w:t>
       </w:r>
       <w:r>
-        <w:t xml:space="preserve">Table A.2 instruments the cumulative world price change over each horizon in the main specification of Eq. (2). Once country × year effects remove the annual variation in world prices, the instrument is weak: first-stage F ranges from 0.5 to 9.6. Weak-instrument-robust Anderson-Rubin confidence sets are uninformative at every horizon except two months, where they bound the pass-through of supply-driven world price shocks between −0.39 and 0.11. The OLS association between cumulative world and local price changes is 0.07 to 0.11 over two to twelve months, within that bound.</w:t>
+        <w:t xml:space="preserve">Table A.2 instruments the cumulative world price change over each horizon in the main specification of Eq. (4). Once country × year effects remove the annual variation in world prices, the instrument is weak: first-stage F ranges from 0.5 to 9.6. Weak-instrument-robust Anderson-Rubin confidence sets are uninformative at every horizon except two months, where they bound the pass-through of supply-driven world price shocks between −0.39 and 0.11. The OLS association between cumulative world and local price changes is 0.07 to 0.11 over two to twelve months, within that bound.</w:t>
       </w:r>
     </w:p>
     <w:p>
@@ -13312,7 +13312,7 @@
         <w:t xml:space="preserve"> </w:t>
       </w:r>
       <w:r>
-        <w:t xml:space="preserve">Dependent variable: cumulative change in the local log price over h months. Endogenous regressor: cumulative change in the matched log world price over the same window, instrumented with the exporter-weather index. Fixed effects and controls as in Eq. (2). Standard errors two-way clustered by country and month. AR: 95% Anderson-Rubin confidence set over a grid from −2 to 3;</w:t>
+        <w:t xml:space="preserve">Dependent variable: cumulative change in the local log price over h months. Endogenous regressor: cumulative change in the matched log world price over the same window, instrumented with the exporter-weather index. Fixed effects and controls as in Eq. (4). Standard errors two-way clustered by country and month. AR: 95% Anderson-Rubin confidence set over a grid from −2 to 3;</w:t>
       </w:r>
       <w:r>
         <w:t xml:space="preserve"> </w:t>

</xml_diff>

<commit_message>
Disclose PAP quintile calibration (het_quintiles.csv); trim to 9,997 words; README/handover/results notes updated
Co-Authored-By: Claude Opus 5.5 <noreply@anthropic.com>
Claude-Session: https://claude.ai/code/session_01NRJbht5wGeLjnfSMkL4ri5
</commit_message>
<xml_diff>
--- a/manuscript/Manuscript_anonymized.docx
+++ b/manuscript/Manuscript_anonymized.docx
@@ -168,7 +168,7 @@
         <w:pStyle w:val="BodyText"/>
       </w:pPr>
       <w:r>
-        <w:t xml:space="preserve">Second, the burden falls on staples that do not cross borders. Maize, sorghum and millet, and cassava, yams and plantains respond by 1.2 to 1.7 percentage points more than rice. Rice and wheat prices do not respond at all. This is not because local weather spares rice and wheat: in FAOSTAT data, an adverse year lowers national rice production by 6.3 percent, about as much as the average across crops. Local supply falls for all staples, but only the prices of staples that cannot be replaced by imports adjust. This is the spatial arbitrage logic behind the law of one price (Fackler and Goodwin, 2001), and our results show it operating across a large share of the developing world.</w:t>
+        <w:t xml:space="preserve">Second, the burden falls on staples that do not cross borders. Maize, sorghum and millet, and cassava, yams and plantains respond by 1.2 to 1.7 percentage points more than rice. Rice and wheat prices do not respond at all. This is not because local weather spares rice and wheat: in FAOSTAT data, an adverse year lowers national rice production by 6.3 percent, about as much as the average across crops. Local supply falls for rice as for the other staples, but only the prices of staples that cannot be replaced by imports adjust. This is the spatial arbitrage logic behind the law of one price (Fackler and Goodwin, 2001), and our results show it operating across a large share of the developing world.</w:t>
       </w:r>
     </w:p>
     <w:p>
@@ -7437,7 +7437,7 @@
         <w:pStyle w:val="FirstParagraph"/>
       </w:pPr>
       <w:r>
-        <w:t xml:space="preserve">The forest finds large differences across markets, and they hold up out of sample (Table 4, Panel A). In countries it was not trained on, the tercile it ranks highest shows a six-month response of 2.16 percent (SE 0.51). The lowest and middle terciles show 0.47 percent (SE 0.23) and 0.50 percent (SE 0.22). The gap between the top and middle terciles is 1.66 pp (SE 0.44). A third of market-months thus carry roughly four times the average burden.</w:t>
+        <w:t xml:space="preserve">The forest finds large differences across markets, and they hold up out of sample (Table 4, Panel A). In countries it was not trained on, the tercile it ranks highest shows a six-month response of 2.16 percent (SE 0.51). The lowest and middle terciles show 0.47 percent (SE 0.23) and 0.50 percent (SE 0.22). The gap between the top and middle terciles is 1.66 pp (SE 0.44). A third of market-months thus carry roughly four times the average burden. The quintiles named in the pre-analysis plan show the same pattern: 2.82 percent (SE 0.64) in the top quintile against 0.37 to 1.16 in the others.</w:t>
       </w:r>
     </w:p>
     <w:p>
@@ -11028,7 +11028,7 @@
         <w:pStyle w:val="BodyText"/>
       </w:pPr>
       <w:r>
-        <w:t xml:space="preserve">How W is built matters in one predictable way. The estimate rises with the aggregation window, from 0.56 percent for one month to 0.81, 0.99 and 1.40 percent for two, three and six months. Prices respond to accumulated seasonal anomalies, not to monthly weather, which makes our three-month baseline conservative. For the same reason the monthly innovation of the three-month index has no detectable effect (0.13 percent, SE 0.12). Averaging heat and soil moisture over land within 50, 100 and 200 km of the market raises the estimate to 1.02, 1.08 and 1.18 percent. Entered jointly with the point measure, the 200 km measure keeps the effect (1.24 percent, SE 0.45) and the point measure falls to −0.06 (SE 0.22). The two measures correlate at 0.93, so this contrast is imprecise, but it points to attenuation in the baseline. Capping z-scores at ±3 or ±5, removing the cap, or detrending W by market leaves the estimate between 0.94 and 1.02 percent. In US dollars the effect is 0.76 percent (SE 0.29); it is slightly smaller because dollar prices also carry exchange-rate noise. Winsorizing the outcome at the 1st and 99th percentiles gives 0.93 percent (SE 0.27).</w:t>
+        <w:t xml:space="preserve">How W is built matters in one predictable way. The estimate rises with the aggregation window, from 0.56 percent for one month to 0.81, 0.99 and 1.40 percent for two, three and six months. Prices respond to accumulated seasonal anomalies, not to monthly weather, which makes our three-month baseline conservative. For the same reason the monthly innovation of the three-month index has no detectable effect (0.13 percent, SE 0.12). Averaging heat and soil moisture over land within 50, 100 and 200 km of the market raises the estimate to 1.02, 1.08 and 1.18 percent. Entered jointly with the point measure, the 200 km measure keeps the effect (1.24 percent, SE 0.45) and the point measure falls to −0.06 (SE 0.22). The two measures correlate at 0.93, so this contrast is imprecise, but it points to attenuation in the baseline. Capping z-scores at ±3 or ±5, removing the cap, or detrending W by market leaves the estimate between 0.94 and 1.02 percent. In US dollars it is 0.76 percent (SE 0.29). Winsorizing the outcome at the 1st and 99th percentiles gives 0.93 percent (SE 0.27).</w:t>
       </w:r>
     </w:p>
     <w:p>
@@ -11036,7 +11036,7 @@
         <w:pStyle w:val="BodyText"/>
       </w:pPr>
       <w:r>
-        <w:t xml:space="preserve">Clustering on 2° or 5° grid cells crossed with month raises the t-statistic to 4.48 and 3.76, and clustering by country alone gives 3.95. The baseline two-way clustering by country and month is the most conservative of these.</w:t>
+        <w:t xml:space="preserve">Clustering on 2° or 5° grid cells crossed with month raises the t-statistic to 4.48 and 3.76, and clustering by country alone gives 3.95. The baseline is the most conservative.</w:t>
       </w:r>
     </w:p>
     <w:bookmarkEnd w:id="42"/>

</xml_diff>